<commit_message>
docs(tm): expand the protocol to the nine-role deliverable set (v3.3)
- 25 numbered deliverables + 3 frozen checklists, grouped by the nine roles
- per-deliverable readability notes; Excel/Word rules and G0 format checks
- field dictionary 5.1-5.25; templates rebuilt to 28 files (16 xlsx + 9 docx + 3 checklists)
- header-for-header template check against the field dictionary: 25/25 pass
</commit_message>
<xml_diff>
--- a/协作/模板/01-项目画像.docx
+++ b/协作/模板/01-项目画像.docx
@@ -136,147 +136,47 @@
         <w:t>1. 基本信息</w:t>
       </w:r>
     </w:p>
-    <w:tbl>
-      <w:tblPr>
-        <w:tblStyle w:val="TableGrid"/>
-        <w:tblW w:type="auto" w:w="0"/>
-        <w:tblLook w:firstColumn="1" w:firstRow="1" w:lastColumn="0" w:lastRow="0" w:noHBand="0" w:noVBand="1" w:val="04A0"/>
-      </w:tblPr>
-      <w:tblGrid>
-        <w:gridCol w:w="4320"/>
-        <w:gridCol w:w="4320"/>
-      </w:tblGrid>
-      <w:tr>
-        <w:tc>
-          <w:tcPr>
-            <w:tcW w:type="dxa" w:w="4320"/>
-          </w:tcPr>
-          <w:p>
-            <w:r>
-              <w:t>项目名称</w:t>
-            </w:r>
-          </w:p>
-        </w:tc>
-        <w:tc>
-          <w:tcPr>
-            <w:tcW w:type="dxa" w:w="4320"/>
-          </w:tcPr>
-          <w:p>
-            <w:r/>
-          </w:p>
-        </w:tc>
-      </w:tr>
-      <w:tr>
-        <w:tc>
-          <w:tcPr>
-            <w:tcW w:type="dxa" w:w="4320"/>
-          </w:tcPr>
-          <w:p>
-            <w:r>
-              <w:t>一句话说明</w:t>
-            </w:r>
-          </w:p>
-        </w:tc>
-        <w:tc>
-          <w:tcPr>
-            <w:tcW w:type="dxa" w:w="4320"/>
-          </w:tcPr>
-          <w:p>
-            <w:r/>
-          </w:p>
-        </w:tc>
-      </w:tr>
-      <w:tr>
-        <w:tc>
-          <w:tcPr>
-            <w:tcW w:type="dxa" w:w="4320"/>
-          </w:tcPr>
-          <w:p>
-            <w:r>
-              <w:t>技术栈</w:t>
-            </w:r>
-          </w:p>
-        </w:tc>
-        <w:tc>
-          <w:tcPr>
-            <w:tcW w:type="dxa" w:w="4320"/>
-          </w:tcPr>
-          <w:p>
-            <w:r/>
-          </w:p>
-        </w:tc>
-      </w:tr>
-      <w:tr>
-        <w:tc>
-          <w:tcPr>
-            <w:tcW w:type="dxa" w:w="4320"/>
-          </w:tcPr>
-          <w:p>
-            <w:r>
-              <w:t>仓库根目录</w:t>
-            </w:r>
-          </w:p>
-        </w:tc>
-        <w:tc>
-          <w:tcPr>
-            <w:tcW w:type="dxa" w:w="4320"/>
-          </w:tcPr>
-          <w:p>
-            <w:r/>
-          </w:p>
-        </w:tc>
-      </w:tr>
-      <w:tr>
-        <w:tc>
-          <w:tcPr>
-            <w:tcW w:type="dxa" w:w="4320"/>
-          </w:tcPr>
-          <w:p>
-            <w:r>
-              <w:t>协作目录</w:t>
-            </w:r>
-          </w:p>
-        </w:tc>
-        <w:tc>
-          <w:tcPr>
-            <w:tcW w:type="dxa" w:w="4320"/>
-          </w:tcPr>
-          <w:p>
-            <w:r>
-              <w:t>协作/</w:t>
-            </w:r>
-          </w:p>
-        </w:tc>
-      </w:tr>
-      <w:tr>
-        <w:tc>
-          <w:tcPr>
-            <w:tcW w:type="dxa" w:w="4320"/>
-          </w:tcPr>
-          <w:p>
-            <w:r>
-              <w:t>角色档位</w:t>
-            </w:r>
-          </w:p>
-        </w:tc>
-        <w:tc>
-          <w:tcPr>
-            <w:tcW w:type="dxa" w:w="4320"/>
-          </w:tcPr>
-          <w:p>
-            <w:r>
-              <w:t>单人 / 小团队 / 完整</w:t>
-            </w:r>
-          </w:p>
-        </w:tc>
-      </w:tr>
-    </w:tbl>
+    <w:p>
+      <w:r>
+        <w:t>项目名称：</w:t>
+      </w:r>
+    </w:p>
+    <w:p>
+      <w:r>
+        <w:t>一句话说明：</w:t>
+      </w:r>
+    </w:p>
+    <w:p>
+      <w:r>
+        <w:t>技术栈：</w:t>
+      </w:r>
+    </w:p>
+    <w:p>
+      <w:r>
+        <w:t>仓库根目录：</w:t>
+      </w:r>
+    </w:p>
+    <w:p>
+      <w:r>
+        <w:t>协作目录：协作/</w:t>
+      </w:r>
+    </w:p>
+    <w:p>
+      <w:r>
+        <w:t>角色档位：单人 / 小团队 / 完整</w:t>
+      </w:r>
+    </w:p>
     <w:p>
       <w:pPr>
         <w:pStyle w:val="Heading1"/>
       </w:pPr>
       <w:r>
         <w:t>2. 命令</w:t>
+      </w:r>
+    </w:p>
+    <w:p>
+      <w:r>
+        <w:t>每条命令都要能直接执行；没有的写「无」。</w:t>
       </w:r>
     </w:p>
     <w:tbl>
@@ -297,6 +197,9 @@
           </w:tcPr>
           <w:p>
             <w:r>
+              <w:rPr>
+                <w:b/>
+              </w:rPr>
               <w:t>用途</w:t>
             </w:r>
           </w:p>
@@ -307,6 +210,9 @@
           </w:tcPr>
           <w:p>
             <w:r>
+              <w:rPr>
+                <w:b/>
+              </w:rPr>
               <w:t>命令</w:t>
             </w:r>
           </w:p>
@@ -317,6 +223,9 @@
           </w:tcPr>
           <w:p>
             <w:r>
+              <w:rPr>
+                <w:b/>
+              </w:rPr>
               <w:t>说明</w:t>
             </w:r>
           </w:p>
@@ -451,6 +360,11 @@
         <w:t>3. 路径</w:t>
       </w:r>
     </w:p>
+    <w:p>
+      <w:r>
+        <w:t>填相对仓库根的路径。</w:t>
+      </w:r>
+    </w:p>
     <w:tbl>
       <w:tblPr>
         <w:tblStyle w:val="TableGrid"/>
@@ -468,6 +382,34 @@
           </w:tcPr>
           <w:p>
             <w:r>
+              <w:rPr>
+                <w:b/>
+              </w:rPr>
+              <w:t>用途</w:t>
+            </w:r>
+          </w:p>
+        </w:tc>
+        <w:tc>
+          <w:tcPr>
+            <w:tcW w:type="dxa" w:w="4320"/>
+          </w:tcPr>
+          <w:p>
+            <w:r>
+              <w:rPr>
+                <w:b/>
+              </w:rPr>
+              <w:t>路径</w:t>
+            </w:r>
+          </w:p>
+        </w:tc>
+      </w:tr>
+      <w:tr>
+        <w:tc>
+          <w:tcPr>
+            <w:tcW w:type="dxa" w:w="4320"/>
+          </w:tcPr>
+          <w:p>
+            <w:r>
               <w:t>源码</w:t>
             </w:r>
           </w:p>
@@ -476,9 +418,7 @@
           <w:tcPr>
             <w:tcW w:type="dxa" w:w="4320"/>
           </w:tcPr>
-          <w:p>
-            <w:r/>
-          </w:p>
+          <w:p/>
         </w:tc>
       </w:tr>
       <w:tr>
@@ -496,9 +436,7 @@
           <w:tcPr>
             <w:tcW w:type="dxa" w:w="4320"/>
           </w:tcPr>
-          <w:p>
-            <w:r/>
-          </w:p>
+          <w:p/>
         </w:tc>
       </w:tr>
       <w:tr>
@@ -516,9 +454,7 @@
           <w:tcPr>
             <w:tcW w:type="dxa" w:w="4320"/>
           </w:tcPr>
-          <w:p>
-            <w:r/>
-          </w:p>
+          <w:p/>
         </w:tc>
       </w:tr>
       <w:tr>
@@ -531,22 +467,6 @@
               <w:t>产物目录</w:t>
             </w:r>
           </w:p>
-        </w:tc>
-        <w:tc>
-          <w:tcPr>
-            <w:tcW w:type="dxa" w:w="4320"/>
-          </w:tcPr>
-          <w:p>
-            <w:r/>
-          </w:p>
-        </w:tc>
-      </w:tr>
-      <w:tr>
-        <w:tc>
-          <w:tcPr>
-            <w:tcW w:type="dxa" w:w="4320"/>
-          </w:tcPr>
-          <w:p/>
         </w:tc>
         <w:tc>
           <w:tcPr>
@@ -565,24 +485,8 @@
       </w:r>
     </w:p>
     <w:p>
-      <w:pPr>
-        <w:pStyle w:val="Heading1"/>
-      </w:pPr>
       <w:r>
-        <w:t>4.1 改动来源</w:t>
-      </w:r>
-    </w:p>
-    <w:p>
-      <w:r>
-        <w:t>git（可归因到提交作者） / 文件快照（无法归因，需人工复核）</w:t>
-      </w:r>
-    </w:p>
-    <w:p>
-      <w:pPr>
-        <w:pStyle w:val="Heading1"/>
-      </w:pPr>
-      <w:r>
-        <w:t>4.2 门禁</w:t>
+        <w:t>改动来源：git / 文件快照（文件快照无法归因到人，需人工复核）</w:t>
       </w:r>
     </w:p>
     <w:p>
@@ -597,7 +501,7 @@
     </w:p>
     <w:p>
       <w:r>
-        <w:t>专项类别：安全 / 性能 / 兼容性</w:t>
+        <w:t>专项类别：安全 / 性能 / 供应链</w:t>
       </w:r>
     </w:p>
     <w:p>

</xml_diff>